<commit_message>
htmx update for form works now
</commit_message>
<xml_diff>
--- a/scholarapp/samples/Staff Member Achievements (1).docx
+++ b/scholarapp/samples/Staff Member Achievements (1).docx
@@ -1148,16 +1148,7 @@
           <w:szCs w:val="28"/>
           <w:lang w:bidi="ar-LB"/>
         </w:rPr>
-        <w:t xml:space="preserve">h) Others </w:t>
-      </w:r>
-      <w:r>
-        <w:rPr>
-          <w:rFonts w:cs="Times New Roman" w:ascii="Times New Roman" w:hAnsi="Times New Roman"/>
-          <w:sz w:val="28"/>
-          <w:szCs w:val="28"/>
-          <w:lang w:bidi="ar-LB"/>
-        </w:rPr>
-        <w:t>( First Section )</w:t>
+        <w:t>h) Others ( First Section )</w:t>
       </w:r>
     </w:p>
     <w:p>
@@ -1682,106 +1673,127 @@
           <w:szCs w:val="28"/>
           <w:lang w:bidi="ar-LB"/>
         </w:rPr>
-        <w:t>Worksh</w:t>
-      </w:r>
-      <w:r>
-        <w:rPr>
-          <w:rFonts w:cs="Times New Roman" w:ascii="Times New Roman" w:hAnsi="Times New Roman"/>
-          <w:sz w:val="28"/>
-          <w:szCs w:val="28"/>
-          <w:lang w:bidi="ar-LB"/>
-        </w:rPr>
-        <w:t>ops</w:t>
-      </w:r>
-    </w:p>
-    <w:p>
-      <w:pPr>
-        <w:pStyle w:val="Normal"/>
-        <w:spacing w:lineRule="auto" w:line="240" w:before="0" w:after="0"/>
-        <w:rPr>
-          <w:rFonts w:ascii="Times New Roman" w:hAnsi="Times New Roman" w:cs="Times New Roman"/>
-          <w:sz w:val="28"/>
-          <w:szCs w:val="28"/>
-          <w:lang w:bidi="ar-LB"/>
-        </w:rPr>
-      </w:pPr>
-      <w:r>
-        <w:rPr/>
-      </w:r>
-    </w:p>
-    <w:p>
-      <w:pPr>
-        <w:pStyle w:val="Normal"/>
-        <w:spacing w:lineRule="auto" w:line="240" w:before="0" w:after="0"/>
-        <w:rPr>
-          <w:rFonts w:ascii="Times New Roman" w:hAnsi="Times New Roman" w:cs="Times New Roman"/>
-          <w:sz w:val="28"/>
-          <w:szCs w:val="28"/>
-          <w:lang w:bidi="ar-LB"/>
-        </w:rPr>
-      </w:pPr>
-      <w:r>
-        <w:rPr/>
-      </w:r>
-    </w:p>
-    <w:p>
-      <w:pPr>
-        <w:pStyle w:val="Normal"/>
-        <w:spacing w:lineRule="auto" w:line="240" w:before="0" w:after="0"/>
-        <w:rPr>
-          <w:rFonts w:ascii="Times New Roman" w:hAnsi="Times New Roman" w:cs="Times New Roman"/>
-          <w:sz w:val="28"/>
-          <w:szCs w:val="28"/>
-          <w:lang w:bidi="ar-LB"/>
-        </w:rPr>
-      </w:pPr>
-      <w:r>
-        <w:rPr/>
-      </w:r>
-    </w:p>
-    <w:p>
-      <w:pPr>
-        <w:pStyle w:val="Normal"/>
-        <w:spacing w:lineRule="auto" w:line="240" w:before="0" w:after="0"/>
-        <w:rPr>
-          <w:rFonts w:ascii="Times New Roman" w:hAnsi="Times New Roman" w:cs="Times New Roman"/>
-          <w:sz w:val="28"/>
-          <w:szCs w:val="28"/>
-          <w:lang w:bidi="ar-LB"/>
-        </w:rPr>
-      </w:pPr>
-      <w:r>
-        <w:rPr/>
-      </w:r>
-    </w:p>
-    <w:p>
-      <w:pPr>
-        <w:pStyle w:val="Normal"/>
-        <w:spacing w:lineRule="auto" w:line="240" w:before="0" w:after="0"/>
-        <w:rPr>
-          <w:rFonts w:ascii="Times New Roman" w:hAnsi="Times New Roman" w:cs="Times New Roman"/>
-          <w:sz w:val="28"/>
-          <w:szCs w:val="28"/>
-          <w:lang w:bidi="ar-LB"/>
-        </w:rPr>
-      </w:pPr>
-      <w:r>
-        <w:rPr/>
-      </w:r>
-    </w:p>
-    <w:p>
-      <w:pPr>
-        <w:pStyle w:val="Normal"/>
-        <w:spacing w:lineRule="auto" w:line="240" w:before="0" w:after="0"/>
-        <w:rPr>
-          <w:rFonts w:ascii="Times New Roman" w:hAnsi="Times New Roman" w:cs="Times New Roman"/>
-          <w:sz w:val="28"/>
-          <w:szCs w:val="28"/>
-          <w:lang w:bidi="ar-LB"/>
-        </w:rPr>
-      </w:pPr>
-      <w:r>
-        <w:rPr/>
+        <w:t>Workshops</w:t>
+      </w:r>
+    </w:p>
+    <w:p>
+      <w:pPr>
+        <w:pStyle w:val="Normal"/>
+        <w:spacing w:lineRule="auto" w:line="240" w:before="0" w:after="0"/>
+        <w:rPr>
+          <w:rFonts w:ascii="Times New Roman" w:hAnsi="Times New Roman" w:cs="Times New Roman"/>
+          <w:sz w:val="28"/>
+          <w:szCs w:val="28"/>
+          <w:lang w:bidi="ar-LB"/>
+        </w:rPr>
+      </w:pPr>
+      <w:r>
+        <w:rPr>
+          <w:rFonts w:cs="Times New Roman" w:ascii="Times New Roman" w:hAnsi="Times New Roman"/>
+          <w:sz w:val="28"/>
+          <w:szCs w:val="28"/>
+          <w:lang w:bidi="ar-LB"/>
+        </w:rPr>
+      </w:r>
+    </w:p>
+    <w:p>
+      <w:pPr>
+        <w:pStyle w:val="Normal"/>
+        <w:spacing w:lineRule="auto" w:line="240" w:before="0" w:after="0"/>
+        <w:rPr>
+          <w:rFonts w:ascii="Times New Roman" w:hAnsi="Times New Roman" w:cs="Times New Roman"/>
+          <w:sz w:val="28"/>
+          <w:szCs w:val="28"/>
+          <w:lang w:bidi="ar-LB"/>
+        </w:rPr>
+      </w:pPr>
+      <w:r>
+        <w:rPr>
+          <w:rFonts w:cs="Times New Roman" w:ascii="Times New Roman" w:hAnsi="Times New Roman"/>
+          <w:sz w:val="28"/>
+          <w:szCs w:val="28"/>
+          <w:lang w:bidi="ar-LB"/>
+        </w:rPr>
+      </w:r>
+    </w:p>
+    <w:p>
+      <w:pPr>
+        <w:pStyle w:val="Normal"/>
+        <w:spacing w:lineRule="auto" w:line="240" w:before="0" w:after="0"/>
+        <w:rPr>
+          <w:rFonts w:ascii="Times New Roman" w:hAnsi="Times New Roman" w:cs="Times New Roman"/>
+          <w:sz w:val="28"/>
+          <w:szCs w:val="28"/>
+          <w:lang w:bidi="ar-LB"/>
+        </w:rPr>
+      </w:pPr>
+      <w:r>
+        <w:rPr>
+          <w:rFonts w:cs="Times New Roman" w:ascii="Times New Roman" w:hAnsi="Times New Roman"/>
+          <w:sz w:val="28"/>
+          <w:szCs w:val="28"/>
+          <w:lang w:bidi="ar-LB"/>
+        </w:rPr>
+      </w:r>
+    </w:p>
+    <w:p>
+      <w:pPr>
+        <w:pStyle w:val="Normal"/>
+        <w:spacing w:lineRule="auto" w:line="240" w:before="0" w:after="0"/>
+        <w:rPr>
+          <w:rFonts w:ascii="Times New Roman" w:hAnsi="Times New Roman" w:cs="Times New Roman"/>
+          <w:sz w:val="28"/>
+          <w:szCs w:val="28"/>
+          <w:lang w:bidi="ar-LB"/>
+        </w:rPr>
+      </w:pPr>
+      <w:r>
+        <w:rPr>
+          <w:rFonts w:cs="Times New Roman" w:ascii="Times New Roman" w:hAnsi="Times New Roman"/>
+          <w:sz w:val="28"/>
+          <w:szCs w:val="28"/>
+          <w:lang w:bidi="ar-LB"/>
+        </w:rPr>
+      </w:r>
+    </w:p>
+    <w:p>
+      <w:pPr>
+        <w:pStyle w:val="Normal"/>
+        <w:spacing w:lineRule="auto" w:line="240" w:before="0" w:after="0"/>
+        <w:rPr>
+          <w:rFonts w:ascii="Times New Roman" w:hAnsi="Times New Roman" w:cs="Times New Roman"/>
+          <w:sz w:val="28"/>
+          <w:szCs w:val="28"/>
+          <w:lang w:bidi="ar-LB"/>
+        </w:rPr>
+      </w:pPr>
+      <w:r>
+        <w:rPr>
+          <w:rFonts w:cs="Times New Roman" w:ascii="Times New Roman" w:hAnsi="Times New Roman"/>
+          <w:sz w:val="28"/>
+          <w:szCs w:val="28"/>
+          <w:lang w:bidi="ar-LB"/>
+        </w:rPr>
+      </w:r>
+    </w:p>
+    <w:p>
+      <w:pPr>
+        <w:pStyle w:val="Normal"/>
+        <w:spacing w:lineRule="auto" w:line="240" w:before="0" w:after="0"/>
+        <w:rPr>
+          <w:rFonts w:ascii="Times New Roman" w:hAnsi="Times New Roman" w:cs="Times New Roman"/>
+          <w:sz w:val="28"/>
+          <w:szCs w:val="28"/>
+          <w:lang w:bidi="ar-LB"/>
+        </w:rPr>
+      </w:pPr>
+      <w:r>
+        <w:rPr>
+          <w:rFonts w:cs="Times New Roman" w:ascii="Times New Roman" w:hAnsi="Times New Roman"/>
+          <w:sz w:val="28"/>
+          <w:szCs w:val="28"/>
+          <w:lang w:bidi="ar-LB"/>
+        </w:rPr>
       </w:r>
     </w:p>
     <w:p>
@@ -1841,16 +1853,7 @@
         </w:rPr>
       </w:pPr>
       <w:r>
-        <w:rPr>
-          <w:rFonts w:cs="Times New Roman" w:ascii="Times New Roman" w:hAnsi="Times New Roman"/>
-          <w:b w:val="false"/>
-          <w:bCs w:val="false"/>
-          <w:sz w:val="32"/>
-          <w:szCs w:val="32"/>
-          <w:lang w:bidi="ar-LB"/>
-        </w:rPr>
-        <w:tab/>
-        <w:t>answer10</w:t>
+        <w:rPr/>
       </w:r>
     </w:p>
     <w:p>
@@ -1955,16 +1958,7 @@
           <w:szCs w:val="28"/>
           <w:lang w:bidi="ar-LB"/>
         </w:rPr>
-        <w:t xml:space="preserve">Others </w:t>
-      </w:r>
-      <w:r>
-        <w:rPr>
-          <w:rFonts w:cs="Times New Roman" w:ascii="Times New Roman" w:hAnsi="Times New Roman"/>
-          <w:sz w:val="28"/>
-          <w:szCs w:val="28"/>
-          <w:lang w:bidi="ar-LB"/>
-        </w:rPr>
-        <w:t>( Second Section )</w:t>
+        <w:t>Others ( Second Section )</w:t>
       </w:r>
     </w:p>
     <w:p>
@@ -2021,7 +2015,18 @@
           <w:szCs w:val="32"/>
           <w:lang w:bidi="ar-LB"/>
         </w:rPr>
-        <w:t>answer11</w:t>
+        <w:t>answer1</w:t>
+      </w:r>
+      <w:r>
+        <w:rPr>
+          <w:rFonts w:cs="Times New Roman" w:ascii="Times New Roman" w:hAnsi="Times New Roman"/>
+          <w:b w:val="false"/>
+          <w:bCs w:val="false"/>
+          <w:sz w:val="32"/>
+          <w:szCs w:val="32"/>
+          <w:lang w:bidi="ar-LB"/>
+        </w:rPr>
+        <w:t>0</w:t>
       </w:r>
     </w:p>
     <w:p>
@@ -2170,7 +2175,18 @@
           <w:szCs w:val="32"/>
           <w:lang w:bidi="ar-LB"/>
         </w:rPr>
-        <w:t>answer12</w:t>
+        <w:t>answer1</w:t>
+      </w:r>
+      <w:r>
+        <w:rPr>
+          <w:rFonts w:cs="Times New Roman" w:ascii="Times New Roman" w:hAnsi="Times New Roman"/>
+          <w:b w:val="false"/>
+          <w:bCs w:val="false"/>
+          <w:sz w:val="32"/>
+          <w:szCs w:val="32"/>
+          <w:lang w:bidi="ar-LB"/>
+        </w:rPr>
+        <w:t>1</w:t>
       </w:r>
     </w:p>
     <w:p>
@@ -2307,7 +2323,18 @@
           <w:szCs w:val="32"/>
           <w:lang w:bidi="ar-LB"/>
         </w:rPr>
-        <w:t>answer13</w:t>
+        <w:t>answer1</w:t>
+      </w:r>
+      <w:r>
+        <w:rPr>
+          <w:rFonts w:cs="Times New Roman" w:ascii="Times New Roman" w:hAnsi="Times New Roman"/>
+          <w:b w:val="false"/>
+          <w:bCs w:val="false"/>
+          <w:sz w:val="32"/>
+          <w:szCs w:val="32"/>
+          <w:lang w:bidi="ar-LB"/>
+        </w:rPr>
+        <w:t>2</w:t>
       </w:r>
     </w:p>
     <w:p>
@@ -2444,7 +2471,18 @@
           <w:szCs w:val="32"/>
           <w:lang w:bidi="ar-LB"/>
         </w:rPr>
-        <w:t>answer14</w:t>
+        <w:t>answer1</w:t>
+      </w:r>
+      <w:r>
+        <w:rPr>
+          <w:rFonts w:cs="Times New Roman" w:ascii="Times New Roman" w:hAnsi="Times New Roman"/>
+          <w:b w:val="false"/>
+          <w:bCs w:val="false"/>
+          <w:sz w:val="32"/>
+          <w:szCs w:val="32"/>
+          <w:lang w:bidi="ar-LB"/>
+        </w:rPr>
+        <w:t>3</w:t>
       </w:r>
     </w:p>
     <w:p>
@@ -2581,7 +2619,18 @@
           <w:szCs w:val="32"/>
           <w:lang w:bidi="ar-LB"/>
         </w:rPr>
-        <w:t>answer15</w:t>
+        <w:t>answer1</w:t>
+      </w:r>
+      <w:r>
+        <w:rPr>
+          <w:rFonts w:cs="Times New Roman" w:ascii="Times New Roman" w:hAnsi="Times New Roman"/>
+          <w:b w:val="false"/>
+          <w:bCs w:val="false"/>
+          <w:sz w:val="32"/>
+          <w:szCs w:val="32"/>
+          <w:lang w:bidi="ar-LB"/>
+        </w:rPr>
+        <w:t>4</w:t>
       </w:r>
     </w:p>
     <w:p>
@@ -2778,7 +2827,18 @@
           <w:szCs w:val="32"/>
           <w:lang w:bidi="ar-LB"/>
         </w:rPr>
-        <w:t>answer16</w:t>
+        <w:t>answer1</w:t>
+      </w:r>
+      <w:r>
+        <w:rPr>
+          <w:rFonts w:cs="Times New Roman" w:ascii="Times New Roman" w:hAnsi="Times New Roman"/>
+          <w:b w:val="false"/>
+          <w:bCs w:val="false"/>
+          <w:sz w:val="32"/>
+          <w:szCs w:val="32"/>
+          <w:lang w:bidi="ar-LB"/>
+        </w:rPr>
+        <w:t>5</w:t>
       </w:r>
     </w:p>
     <w:p>
@@ -2883,16 +2943,7 @@
           <w:szCs w:val="28"/>
           <w:lang w:bidi="ar-LB"/>
         </w:rPr>
-        <w:t xml:space="preserve">Others </w:t>
-      </w:r>
-      <w:r>
-        <w:rPr>
-          <w:rFonts w:cs="Times New Roman" w:ascii="Times New Roman" w:hAnsi="Times New Roman"/>
-          <w:sz w:val="28"/>
-          <w:szCs w:val="28"/>
-          <w:lang w:bidi="ar-LB"/>
-        </w:rPr>
-        <w:t>( Third Section )</w:t>
+        <w:t>Others ( Third Section )</w:t>
       </w:r>
     </w:p>
     <w:p>
@@ -2920,7 +2971,18 @@
           <w:szCs w:val="32"/>
           <w:lang w:bidi="ar-LB"/>
         </w:rPr>
-        <w:t>answer17</w:t>
+        <w:t>answer1</w:t>
+      </w:r>
+      <w:r>
+        <w:rPr>
+          <w:rFonts w:cs="Times New Roman" w:ascii="Times New Roman" w:hAnsi="Times New Roman"/>
+          <w:b w:val="false"/>
+          <w:bCs w:val="false"/>
+          <w:sz w:val="32"/>
+          <w:szCs w:val="32"/>
+          <w:lang w:bidi="ar-LB"/>
+        </w:rPr>
+        <w:t>6</w:t>
       </w:r>
     </w:p>
     <w:p>

</xml_diff>